<commit_message>
docs: mostrar el sitio personalizado descargado en el cliente
</commit_message>
<xml_diff>
--- a/docs/Informe-Practica-Docker-IA.docx
+++ b/docs/Informe-Practica-Docker-IA.docx
@@ -68,7 +68,7 @@
         <w:rPr>
           <w:b w:val="0"/>
         </w:rPr>
-        <w:t xml:space="preserve"> Las imágenes nathernandez/ubuntuweb:v1 y nathernandez/sitio-docker:v1 están disponibles públicamente en Docker Hub. Se verificaron sin autenticación y se descargó nathernandez/ubuntuweb:v1 desde clienteUbuntu; el contenedor webcliente respondió correctamente en el puerto 9900. El proyecto se conserva en el repositorio privado nathernandez1189/practica-docker-ia (https://github.com/nathernandez1189/practica-docker-ia), con commits organizados por configuración, web y volúmenes, IA y Flask, y documentación y evidencias.</w:t>
+        <w:t xml:space="preserve"> Las imágenes nathernandez/ubuntuweb:v1 y nathernandez/sitio-docker:v1 están disponibles públicamente en Docker Hub. Se verificaron sin autenticación y ambas se descargaron desde clienteUbuntu. El contenedor webcliente usa actualmente nathernandez/sitio-docker:v1 y muestra el sitio personalizado en el puerto 9900. El proyecto se conserva en el repositorio privado nathernandez1189/practica-docker-ia (https://github.com/nathernandez1189/practica-docker-ia), con commits organizados por configuración, web y volúmenes, IA y Flask, y documentación y evidencias.</w:t>
       </w:r>
     </w:p>
     <w:p>
@@ -516,7 +516,51 @@
         <w:rPr>
           <w:b w:val="0"/>
         </w:rPr>
-        <w:t>El cliente devolvió «Bienvenidos al servidor de prueba». La imagen descargada tiene el mismo digest publicado: sha256:84d2c76ca8e902c6a99803ae0426b2a572c250b6d8374ad6f107273599fd9177. El registro completo está en 05-descarga-dockerhub-cliente.log. Docker reutilizó las capas que ya existían tras la prueba local previa y obtuvo del registro la referencia publicada.</w:t>
+        <w:t>El cliente devolvió «Bienvenidos al servidor de prueba». La imagen descargada tiene el mismo digest publicado: sha256:84d2c76ca8e902c6a99803ae0426b2a572c250b6d8374ad6f107273599fd9177. Después se descargó nathernandez/sitio-docker:v1 y se recreó webcliente para dejar visible el sitio personalizado en la misma dirección. Su digest publicado es sha256:3b9de05d882a240b123220873e907bca2cba592592e1e1591f8fe80049e8a383. Los registros completos están en 05-descarga-dockerhub-cliente.log y 05-sitio-docker-en-cliente.log.</w:t>
+      </w:r>
+    </w:p>
+    <w:p>
+      <w:r>
+        <w:drawing>
+          <wp:inline xmlns:a="http://schemas.openxmlformats.org/drawingml/2006/main" xmlns:pic="http://schemas.openxmlformats.org/drawingml/2006/picture">
+            <wp:extent cx="5943600" cy="6691108"/>
+            <wp:docPr id="2" name="Picture 2"/>
+            <wp:cNvGraphicFramePr>
+              <a:graphicFrameLocks noChangeAspect="1"/>
+            </wp:cNvGraphicFramePr>
+            <a:graphic>
+              <a:graphicData uri="http://schemas.openxmlformats.org/drawingml/2006/picture">
+                <pic:pic>
+                  <pic:nvPicPr>
+                    <pic:cNvPr id="0" name="04-sitio-personalizado.png"/>
+                    <pic:cNvPicPr/>
+                  </pic:nvPicPr>
+                  <pic:blipFill>
+                    <a:blip r:embed="rId10"/>
+                    <a:stretch>
+                      <a:fillRect/>
+                    </a:stretch>
+                  </pic:blipFill>
+                  <pic:spPr>
+                    <a:xfrm>
+                      <a:off x="0" y="0"/>
+                      <a:ext cx="5943600" cy="6691108"/>
+                    </a:xfrm>
+                    <a:prstGeom prst="rect"/>
+                  </pic:spPr>
+                </pic:pic>
+              </a:graphicData>
+            </a:graphic>
+          </wp:inline>
+        </w:drawing>
+      </w:r>
+    </w:p>
+    <w:p>
+      <w:pPr>
+        <w:pStyle w:val="Caption"/>
+      </w:pPr>
+      <w:r>
+        <w:t>Sitio personalizado descargado desde Docker Hub y ejecutado en clienteUbuntu</w:t>
       </w:r>
     </w:p>
     <w:p>
@@ -747,7 +791,7 @@
         <w:drawing>
           <wp:inline xmlns:a="http://schemas.openxmlformats.org/drawingml/2006/main" xmlns:pic="http://schemas.openxmlformats.org/drawingml/2006/picture">
             <wp:extent cx="5943600" cy="2569849"/>
-            <wp:docPr id="2" name="Picture 2"/>
+            <wp:docPr id="3" name="Picture 3"/>
             <wp:cNvGraphicFramePr>
               <a:graphicFrameLocks noChangeAspect="1"/>
             </wp:cNvGraphicFramePr>

</xml_diff>